<commit_message>
Elimino encuesta de percepción
La encuesta de percepción de seguridad tiene un problema de anonimización e identificación de los encuestados que no puedo resolver en este momento. Es mejor bajarla por ahora.
</commit_message>
<xml_diff>
--- a/00_Documentacion/anexo_metodologico_Data-Gobierno-Democracia.docx
+++ b/00_Documentacion/anexo_metodologico_Data-Gobierno-Democracia.docx
@@ -26,7 +26,7 @@
         <w:t xml:space="preserve"> </w:t>
       </w:r>
       <w:r>
-        <w:t xml:space="preserve">borrador 0.7 ·</w:t>
+        <w:t xml:space="preserve">borrador 0.8 ·</w:t>
       </w:r>
       <w:r>
         <w:t xml:space="preserve"> </w:t>
@@ -4174,7 +4174,22 @@
               <w:jc w:val="left"/>
             </w:pPr>
             <w:r>
-              <w:t xml:space="preserve">1 parquet anonimizado, 5.59 MiB (23.216 filas × 1.356 columnas), categoría E</w:t>
+              <w:t xml:space="preserve">1 parquet anonimizado, 5,59 MiB (23.216 filas × 1.356 columnas), categoría E.</w:t>
+            </w:r>
+            <w:r>
+              <w:t xml:space="preserve"> </w:t>
+            </w:r>
+            <w:r>
+              <w:rPr>
+                <w:b/>
+              </w:rPr>
+              <w:t xml:space="preserve">Fuera del repositorio desde el 2026-09-17</w:t>
+            </w:r>
+            <w:r>
+              <w:t xml:space="preserve"> </w:t>
+            </w:r>
+            <w:r>
+              <w:t xml:space="preserve">mientras se decide P-18.</w:t>
             </w:r>
           </w:p>
         </w:tc>
@@ -7156,7 +7171,7 @@
         <w:t xml:space="preserve"> </w:t>
       </w:r>
       <w:r>
-        <w:t xml:space="preserve">entró anonimizada en sus identificadores directos y en el barrio del encuestado; conserva manzana del marco muestral, estrato, sexo y edad exacta, con riesgo residual de reidentificación (pendiente P-18).</w:t>
+        <w:t xml:space="preserve">está fuera del repositorio, incluso en su versión anonimizada: la medición de riesgo (sección 10.4) mostró que casi la mitad de los registros son únicos. Vuelve a entrar cuando se decida P-18.</w:t>
       </w:r>
     </w:p>
     <w:p>
@@ -7935,6 +7950,52 @@
                 <w:rStyle w:val="VerbatimChar"/>
               </w:rPr>
               <w:t xml:space="preserve">00_Documentacion/README.md</w:t>
+            </w:r>
+          </w:p>
+        </w:tc>
+        <w:tc>
+          <w:p>
+            <w:pPr>
+              <w:pStyle w:val="Compact"/>
+              <w:jc w:val="left"/>
+            </w:pPr>
+            <w:r>
+              <w:t xml:space="preserve">Pendiente</w:t>
+            </w:r>
+          </w:p>
+        </w:tc>
+      </w:tr>
+      <w:tr>
+        <w:tc>
+          <w:p>
+            <w:pPr>
+              <w:pStyle w:val="Compact"/>
+              <w:jc w:val="left"/>
+            </w:pPr>
+            <w:r>
+              <w:t xml:space="preserve">0.8</w:t>
+            </w:r>
+          </w:p>
+        </w:tc>
+        <w:tc>
+          <w:p>
+            <w:pPr>
+              <w:pStyle w:val="Compact"/>
+              <w:jc w:val="left"/>
+            </w:pPr>
+            <w:r>
+              <w:t xml:space="preserve">2026-09-17</w:t>
+            </w:r>
+          </w:p>
+        </w:tc>
+        <w:tc>
+          <w:p>
+            <w:pPr>
+              <w:pStyle w:val="Compact"/>
+              <w:jc w:val="left"/>
+            </w:pPr>
+            <w:r>
+              <w:t xml:space="preserve">La encuesta anonimizada sale del repositorio mientras se decide P-18; se documenta que la versión ya publicada permanece en el historial de git</w:t>
             </w:r>
           </w:p>
         </w:tc>

</xml_diff>

<commit_message>
Ajuste versiones de archivos
Elimino versiones de 3 archivos que tenían múltiples.
</commit_message>
<xml_diff>
--- a/00_Documentacion/anexo_metodologico_Data-Gobierno-Democracia.docx
+++ b/00_Documentacion/anexo_metodologico_Data-Gobierno-Democracia.docx
@@ -26,7 +26,7 @@
         <w:t xml:space="preserve"> </w:t>
       </w:r>
       <w:r>
-        <w:t xml:space="preserve">borrador 0.8 ·</w:t>
+        <w:t xml:space="preserve">borrador 0.9 ·</w:t>
       </w:r>
       <w:r>
         <w:t xml:space="preserve"> </w:t>
@@ -7071,7 +7071,22 @@
         <w:t xml:space="preserve">no se borra ni se sobrescribe ningún archivo</w:t>
       </w:r>
       <w:r>
-        <w:t xml:space="preserve">: el nuevo corte entra junto al anterior. Ya hay precedentes de convivencia de versiones:</w:t>
+        <w:t xml:space="preserve">: el nuevo corte entra junto al anterior. Cuando conviven varias versiones, la columna</w:t>
+      </w:r>
+      <w:r>
+        <w:t xml:space="preserve"> </w:t>
+      </w:r>
+      <w:r>
+        <w:rPr>
+          <w:rStyle w:val="VerbatimChar"/>
+        </w:rPr>
+        <w:t xml:space="preserve">version</w:t>
+      </w:r>
+      <w:r>
+        <w:t xml:space="preserve"> </w:t>
+      </w:r>
+      <w:r>
+        <w:t xml:space="preserve">del registro dice cuál es la vigente y la nota explica por qué. Casos ya resueltos: IRCA, mortalidad infantil y población. Otros casos de convivencia:</w:t>
       </w:r>
     </w:p>
     <w:p>
@@ -7096,30 +7111,6 @@
       </w:pPr>
       <w:r>
         <w:t xml:space="preserve">valor agregado municipal;</w:t>
-      </w:r>
-    </w:p>
-    <w:p>
-      <w:pPr>
-        <w:numPr>
-          <w:ilvl w:val="0"/>
-          <w:numId w:val="1022"/>
-        </w:numPr>
-        <w:pStyle w:val="Compact"/>
-      </w:pPr>
-      <w:r>
-        <w:t xml:space="preserve">IRCA;</w:t>
-      </w:r>
-    </w:p>
-    <w:p>
-      <w:pPr>
-        <w:numPr>
-          <w:ilvl w:val="0"/>
-          <w:numId w:val="1022"/>
-        </w:numPr>
-        <w:pStyle w:val="Compact"/>
-      </w:pPr>
-      <w:r>
-        <w:t xml:space="preserve">mortalidad infantil.</w:t>
       </w:r>
     </w:p>
     <w:p>
@@ -7384,13 +7375,13 @@
         <w:rPr>
           <w:b/>
         </w:rPr>
-        <w:t xml:space="preserve">Versiones por confirmar:</w:t>
-      </w:r>
-      <w:r>
-        <w:t xml:space="preserve"> </w:t>
-      </w:r>
-      <w:r>
-        <w:t xml:space="preserve">el IRCA de Antioquia frente al histórico nacional, y dos ediciones de mortalidad infantil con las mismas hojas y valores distintos.</w:t>
+        <w:t xml:space="preserve">Versiones declaradas el 2026-09-17:</w:t>
+      </w:r>
+      <w:r>
+        <w:t xml:space="preserve"> </w:t>
+      </w:r>
+      <w:r>
+        <w:t xml:space="preserve">IRCA (vigente el histórico nacional), mortalidad infantil (vigente la edición 2005-2025) y población (vigente PPED 2018-2042, con lo que el repositorio queda sin serie de referencia para 1985-2017).</w:t>
       </w:r>
     </w:p>
     <w:p>
@@ -7996,6 +7987,52 @@
             </w:pPr>
             <w:r>
               <w:t xml:space="preserve">La encuesta anonimizada sale del repositorio mientras se decide P-18; se documenta que la versión ya publicada permanece en el historial de git</w:t>
+            </w:r>
+          </w:p>
+        </w:tc>
+        <w:tc>
+          <w:p>
+            <w:pPr>
+              <w:pStyle w:val="Compact"/>
+              <w:jc w:val="left"/>
+            </w:pPr>
+            <w:r>
+              <w:t xml:space="preserve">Pendiente</w:t>
+            </w:r>
+          </w:p>
+        </w:tc>
+      </w:tr>
+      <w:tr>
+        <w:tc>
+          <w:p>
+            <w:pPr>
+              <w:pStyle w:val="Compact"/>
+              <w:jc w:val="left"/>
+            </w:pPr>
+            <w:r>
+              <w:t xml:space="preserve">0.9</w:t>
+            </w:r>
+          </w:p>
+        </w:tc>
+        <w:tc>
+          <w:p>
+            <w:pPr>
+              <w:pStyle w:val="Compact"/>
+              <w:jc w:val="left"/>
+            </w:pPr>
+            <w:r>
+              <w:t xml:space="preserve">2026-09-17</w:t>
+            </w:r>
+          </w:p>
+        </w:tc>
+        <w:tc>
+          <w:p>
+            <w:pPr>
+              <w:pStyle w:val="Compact"/>
+              <w:jc w:val="left"/>
+            </w:pPr>
+            <w:r>
+              <w:t xml:space="preserve">Versiones vigentes declaradas para IRCA, mortalidad infantil y población (P-08 y P-09 cerrados)</w:t>
             </w:r>
           </w:p>
         </w:tc>

</xml_diff>